<commit_message>
Minor Changes - 4
</commit_message>
<xml_diff>
--- a/assets/Alok-Deo-Singh-Resume.docx
+++ b/assets/Alok-Deo-Singh-Resume.docx
@@ -81,6 +81,46 @@
         </w:tc>
       </w:tr>
     </w:tbl>
+    <w:p>
+      <w:pPr>
+        <w:pBdr>
+          <w:bottom w:val="single" w:color="00C892" w:sz="14" w:space="3"/>
+        </w:pBdr>
+        <w:spacing w:after="110" w:before="240"/>
+      </w:pPr>
+      <w:r>
+        <w:rPr>
+          <w:rFonts w:ascii="Arial" w:cs="Arial" w:eastAsia="Arial" w:hAnsi="Arial"/>
+          <w:b/>
+          <w:bCs/>
+          <w:color w:val="010028"/>
+          <w:spacing w:val="20"/>
+          <w:sz w:val="24"/>
+          <w:szCs w:val="24"/>
+        </w:rPr>
+        <w:t xml:space="preserve">TARGET ROLE</w:t>
+      </w:r>
+    </w:p>
+    <w:p>
+      <w:pPr>
+        <w:pBdr>
+          <w:left w:val="single" w:color="00C892" w:sz="18" w:space="10"/>
+        </w:pBdr>
+        <w:spacing w:after="60"/>
+        <w:ind w:left="180"/>
+      </w:pPr>
+      <w:r>
+        <w:rPr>
+          <w:rFonts w:ascii="Arial" w:cs="Arial" w:eastAsia="Arial" w:hAnsi="Arial"/>
+          <w:i/>
+          <w:iCs/>
+          <w:color w:val="010028"/>
+          <w:sz w:val="21"/>
+          <w:szCs w:val="21"/>
+        </w:rPr>
+        <w:t xml:space="preserve">I'm looking for a role driving AI transformation and business strategy execution — turning ambitious goals into delivered outcomes by aligning cross-functional teams, leading change, and building fearless, high-trust organizations.</w:t>
+      </w:r>
+    </w:p>
     <w:p>
       <w:pPr>
         <w:pBdr>

</xml_diff>